<commit_message>
doc: upload final report with gh link
</commit_message>
<xml_diff>
--- a/23BCE1116.docx
+++ b/23BCE1116.docx
@@ -115,16 +115,26 @@
     <w:p>
       <w:pPr>
         <w:spacing w:after="100" w:before="100" w:lineRule="auto"/>
-        <w:jc w:val="both"/>
-        <w:rPr>
-          <w:rFonts w:ascii="Times New Roman" w:cs="Times New Roman" w:eastAsia="Times New Roman" w:hAnsi="Times New Roman"/>
-          <w:b w:val="1"/>
-          <w:bCs w:val="1"/>
+        <w:rPr>
+          <w:rFonts w:ascii="Times New Roman" w:cs="Times New Roman" w:eastAsia="Times New Roman" w:hAnsi="Times New Roman"/>
           <w:sz w:val="18"/>
           <w:szCs w:val="18"/>
         </w:rPr>
       </w:pPr>
       <w:r>
+        <w:rPr>
+          <w:rFonts w:ascii="Times New Roman" w:cs="Times New Roman" w:eastAsia="Times New Roman" w:hAnsi="Times New Roman"/>
+          <w:sz w:val="18"/>
+          <w:szCs w:val="18"/>
+          <w:rtl w:val="0"/>
+        </w:rPr>
+        <w:t xml:space="preserve">Github Link: https://github.com/Sasikuttan2163/quantum-secure-mail</w:t>
+      </w:r>
+    </w:p>
+    <w:p>
+      <w:pPr>
+        <w:spacing w:after="100" w:before="100" w:lineRule="auto"/>
+        <w:jc w:val="both"/>
         <w:rPr>
           <w:rFonts w:ascii="Times New Roman" w:cs="Times New Roman" w:eastAsia="Times New Roman" w:hAnsi="Times New Roman"/>
           <w:b w:val="1"/>
@@ -133,26 +143,27 @@
           <w:iCs w:val="1"/>
           <w:sz w:val="18"/>
           <w:szCs w:val="18"/>
-          <w:rtl w:val="0"/>
-        </w:rPr>
-        <w:t xml:space="preserve">Abstract</w:t>
-      </w:r>
-      <w:r>
+        </w:rPr>
+      </w:pPr>
+      <w:r>
+        <w:rPr>
+          <w:rtl w:val="0"/>
+        </w:rPr>
+      </w:r>
+    </w:p>
+    <w:p>
+      <w:pPr>
+        <w:spacing w:after="100" w:before="100" w:lineRule="auto"/>
+        <w:jc w:val="both"/>
         <w:rPr>
           <w:rFonts w:ascii="Times New Roman" w:cs="Times New Roman" w:eastAsia="Times New Roman" w:hAnsi="Times New Roman"/>
           <w:b w:val="1"/>
           <w:bCs w:val="1"/>
           <w:sz w:val="18"/>
           <w:szCs w:val="18"/>
-          <w:rtl w:val="0"/>
-        </w:rPr>
-        <w:t xml:space="preserve"> – Quantum computers bring a lot of potential, as well as danger, to the future of cryptography. There are many systems which deliver security through the use of conventional public key cryptography (PKC), the majority of the communications over secure public networks today are using PKC to provide that level of security. The advent of the quantum computer may lead to a compromise of the existing public key systems because they will be able to finish off the current PKC encryption methods with the increased speed offered via quantum computing. A solution to the above problem with regard to providing secure communications via the principles of quantum physics, is through the use of Quantum Key Distribution (QKD). This project aims to introduce a QKD solution for the problem of providing secure email communications using the principles of QKD and also be compatible with the existing protocols used for email communications today. The solution will be a hybrid system that will consist of a frontend client, a backend encryption engine, and a simulated QKD Key Management Entity (KME). The results of the testing performed for this paper demonstrate that it is possible to incorporate quantum security into the existing communications infrastructure, as there is no need to overhaul the current communications infrastructure, with as part of the solution, an entirely new method of communicating between parties. </w:t>
-      </w:r>
-    </w:p>
-    <w:p>
-      <w:pPr>
-        <w:spacing w:after="100" w:before="100" w:lineRule="auto"/>
-        <w:jc w:val="both"/>
+        </w:rPr>
+      </w:pPr>
+      <w:r>
         <w:rPr>
           <w:rFonts w:ascii="Times New Roman" w:cs="Times New Roman" w:eastAsia="Times New Roman" w:hAnsi="Times New Roman"/>
           <w:b w:val="1"/>
@@ -161,9 +172,26 @@
           <w:iCs w:val="1"/>
           <w:sz w:val="18"/>
           <w:szCs w:val="18"/>
-        </w:rPr>
-      </w:pPr>
-      <w:r>
+          <w:rtl w:val="0"/>
+        </w:rPr>
+        <w:t xml:space="preserve">Abstract</w:t>
+      </w:r>
+      <w:r>
+        <w:rPr>
+          <w:rFonts w:ascii="Times New Roman" w:cs="Times New Roman" w:eastAsia="Times New Roman" w:hAnsi="Times New Roman"/>
+          <w:b w:val="1"/>
+          <w:bCs w:val="1"/>
+          <w:sz w:val="18"/>
+          <w:szCs w:val="18"/>
+          <w:rtl w:val="0"/>
+        </w:rPr>
+        <w:t xml:space="preserve"> – Quantum computers bring a lot of potential, as well as danger, to the future of cryptography. There are many systems which deliver security through the use of conventional public key cryptography (PKC), the majority of the communications over secure public networks today are using PKC to provide that level of security. The advent of the quantum computer may lead to a compromise of the existing public key systems because they will be able to finish off the current PKC encryption methods with the increased speed offered via quantum computing. A solution to the above problem with regard to providing secure communications via the principles of quantum physics, is through the use of Quantum Key Distribution (QKD). This project aims to introduce a QKD solution for the problem of providing secure email communications using the principles of QKD and also be compatible with the existing protocols used for email communications today. The solution will be a hybrid system that will consist of a frontend client, a backend encryption engine, and a simulated QKD Key Management Entity (KME). The results of the testing performed for this paper demonstrate that it is possible to incorporate quantum security into the existing communications infrastructure, as there is no need to overhaul the current communications infrastructure, with as part of the solution, an entirely new method of communicating between parties. </w:t>
+      </w:r>
+    </w:p>
+    <w:p>
+      <w:pPr>
+        <w:spacing w:after="100" w:before="100" w:lineRule="auto"/>
+        <w:jc w:val="both"/>
         <w:rPr>
           <w:rFonts w:ascii="Times New Roman" w:cs="Times New Roman" w:eastAsia="Times New Roman" w:hAnsi="Times New Roman"/>
           <w:b w:val="1"/>
@@ -172,6 +200,17 @@
           <w:iCs w:val="1"/>
           <w:sz w:val="18"/>
           <w:szCs w:val="18"/>
+        </w:rPr>
+      </w:pPr>
+      <w:r>
+        <w:rPr>
+          <w:rFonts w:ascii="Times New Roman" w:cs="Times New Roman" w:eastAsia="Times New Roman" w:hAnsi="Times New Roman"/>
+          <w:b w:val="1"/>
+          <w:bCs w:val="1"/>
+          <w:i w:val="1"/>
+          <w:iCs w:val="1"/>
+          <w:sz w:val="18"/>
+          <w:szCs w:val="18"/>
           <w:rtl w:val="0"/>
         </w:rPr>
         <w:t xml:space="preserve">Keywords – Quantum Key Distribution, ETSI GS QKD 014, Hybrid Encryption, SMTP Security, IMAP Protocol</w:t>
@@ -1041,7 +1080,7 @@
           <w:rFonts w:ascii="Times New Roman" w:cs="Times New Roman" w:eastAsia="Times New Roman" w:hAnsi="Times New Roman"/>
           <w:rtl w:val="0"/>
         </w:rPr>
-        <w:t xml:space="preserve">The operational workflow of sending a secure message commences when the user chooses a target recipient and a security level using the React-based frontend. This request is sent via a context-isolated IPC bridge to the Electron main process. This request is then forwarded to the FastAPI backend via the Electron main process. By default, the system uses a localhost connection on the network address 127.0.0.1 to connect to the internal services. However, this can be set using environment variables. Once the request is sent to the backend, the request is forwarded to the QKD simulator to obtain a 256-bit quantum-derived key via a standardized POST request to the endpoint “/enc_keys.” When the security level is set to L3 Hybrid, the system uses an ephemeral Kyber-512 keypair to encapsulate a shared secret. The session key is obtained by concatenating the QKD-derived key with the Kyber-derived shared secret. This is then passed through a SHA-256 hash function. The ciphertext is encoded as a series of PEM blocks embedded in the body of the email sent via SMTP on port 587 using the STARTTLS protocol. Additionally, custom MIME headers are used to make the emails automatically detectable.</w:t>
+        <w:t xml:space="preserve">The task of sending a message starts when the user chooses a target recipient and a security level using the React-based frontend. This request is sent via a context-isolated IPC bridge to the Electron main process. This request is then forwarded to the FastAPI backend via the Electron main process. By default, the system uses a localhost connection on the network address 127.0.0.1 to connect to the internal services. However, this can be set using environment variables. Once the request is sent to the backend, the request is forwarded to the QKD simulator to obtain a 256-bit quantum-derived key via a standardized POST request to the endpoint “/enc_keys.” When the security level is set to L3 Hybrid, the system uses an ephemeral Kyber-512 keypair to encapsulate a shared secret. The session key is obtained by concatenating the QKD-derived key with the Kyber-derived shared secret. After that it is passed through a SHA-256 hash function. The ciphertext is encoded as a series of PEM blocks embedded in the body of the email sent via SMTP on port 587 using the STARTTLS protocol. Custom MIME headers are used to make the emails automatically detectable.</w:t>
       </w:r>
     </w:p>
     <w:p>
@@ -1219,12 +1258,12 @@
           <wp:inline distB="114300" distT="114300" distL="114300" distR="114300">
             <wp:extent cx="3038475" cy="2082800"/>
             <wp:effectExtent b="0" l="0" r="0" t="0"/>
-            <wp:docPr id="2" name="image7.png"/>
+            <wp:docPr id="2" name="image6.png"/>
             <a:graphic>
               <a:graphicData uri="http://schemas.openxmlformats.org/drawingml/2006/picture">
                 <pic:pic>
                   <pic:nvPicPr>
-                    <pic:cNvPr id="0" name="image7.png"/>
+                    <pic:cNvPr id="0" name="image6.png"/>
                     <pic:cNvPicPr preferRelativeResize="0"/>
                   </pic:nvPicPr>
                   <pic:blipFill>
@@ -1293,12 +1332,12 @@
           <wp:inline distB="114300" distT="114300" distL="114300" distR="114300">
             <wp:extent cx="3038475" cy="2082800"/>
             <wp:effectExtent b="0" l="0" r="0" t="0"/>
-            <wp:docPr id="5" name="image5.png"/>
+            <wp:docPr id="5" name="image7.png"/>
             <a:graphic>
               <a:graphicData uri="http://schemas.openxmlformats.org/drawingml/2006/picture">
                 <pic:pic>
                   <pic:nvPicPr>
-                    <pic:cNvPr id="0" name="image5.png"/>
+                    <pic:cNvPr id="0" name="image7.png"/>
                     <pic:cNvPicPr preferRelativeResize="0"/>
                   </pic:nvPicPr>
                   <pic:blipFill>
@@ -1638,7 +1677,7 @@
           <w:rFonts w:ascii="Times New Roman" w:cs="Times New Roman" w:eastAsia="Times New Roman" w:hAnsi="Times New Roman"/>
           <w:rtl w:val="0"/>
         </w:rPr>
-        <w:t xml:space="preserve">The foundation layer consists of the standard set of protocols in the TCP/IP suite. It offers the bare-bones reliable transport that is required for the upper layers to communicate with public mail servers such as Gmail or Yahoo over the internet in an opaque text format.</w:t>
+        <w:t xml:space="preserve">The foundation layer consists of the standard set of protocols in TCP/IP. It offers the bare-bones reliable transport that is required for the upper layers to communicate with public mail servers such as Gmail or Yahoo over the internet in an opaque text format.</w:t>
       </w:r>
     </w:p>
     <w:p>
@@ -1805,12 +1844,12 @@
           <wp:inline distB="114300" distT="114300" distL="114300" distR="114300">
             <wp:extent cx="3038475" cy="3365500"/>
             <wp:effectExtent b="0" l="0" r="0" t="0"/>
-            <wp:docPr id="4" name="image1.png"/>
+            <wp:docPr id="4" name="image3.png"/>
             <a:graphic>
               <a:graphicData uri="http://schemas.openxmlformats.org/drawingml/2006/picture">
                 <pic:pic>
                   <pic:nvPicPr>
-                    <pic:cNvPr id="0" name="image1.png"/>
+                    <pic:cNvPr id="0" name="image3.png"/>
                     <pic:cNvPicPr preferRelativeResize="0"/>
                   </pic:nvPicPr>
                   <pic:blipFill>
@@ -1879,12 +1918,12 @@
           <wp:inline distB="114300" distT="114300" distL="114300" distR="114300">
             <wp:extent cx="3038475" cy="3365500"/>
             <wp:effectExtent b="0" l="0" r="0" t="0"/>
-            <wp:docPr id="3" name="image6.png"/>
+            <wp:docPr id="3" name="image8.png"/>
             <a:graphic>
               <a:graphicData uri="http://schemas.openxmlformats.org/drawingml/2006/picture">
                 <pic:pic>
                   <pic:nvPicPr>
-                    <pic:cNvPr id="0" name="image6.png"/>
+                    <pic:cNvPr id="0" name="image8.png"/>
                     <pic:cNvPicPr preferRelativeResize="0"/>
                   </pic:nvPicPr>
                   <pic:blipFill>
@@ -2013,12 +2052,12 @@
           <wp:inline distB="114300" distT="114300" distL="114300" distR="114300">
             <wp:extent cx="3038475" cy="3365500"/>
             <wp:effectExtent b="0" l="0" r="0" t="0"/>
-            <wp:docPr id="8" name="image3.png"/>
+            <wp:docPr id="8" name="image5.png"/>
             <a:graphic>
               <a:graphicData uri="http://schemas.openxmlformats.org/drawingml/2006/picture">
                 <pic:pic>
                   <pic:nvPicPr>
-                    <pic:cNvPr id="0" name="image3.png"/>
+                    <pic:cNvPr id="0" name="image5.png"/>
                     <pic:cNvPicPr preferRelativeResize="0"/>
                   </pic:nvPicPr>
                   <pic:blipFill>
@@ -2088,12 +2127,12 @@
           <wp:inline distB="114300" distT="114300" distL="114300" distR="114300">
             <wp:extent cx="3038475" cy="1803400"/>
             <wp:effectExtent b="0" l="0" r="0" t="0"/>
-            <wp:docPr id="6" name="image8.png"/>
+            <wp:docPr id="6" name="image1.png"/>
             <a:graphic>
               <a:graphicData uri="http://schemas.openxmlformats.org/drawingml/2006/picture">
                 <pic:pic>
                   <pic:nvPicPr>
-                    <pic:cNvPr id="0" name="image8.png"/>
+                    <pic:cNvPr id="0" name="image1.png"/>
                     <pic:cNvPicPr preferRelativeResize="0"/>
                   </pic:nvPicPr>
                   <pic:blipFill>

</xml_diff>

<commit_message>
doc: update report title
</commit_message>
<xml_diff>
--- a/23BCE1116.docx
+++ b/23BCE1116.docx
@@ -19,18 +19,60 @@
           <w:szCs w:val="48"/>
           <w:rtl w:val="0"/>
         </w:rPr>
-        <w:t xml:space="preserve">Detecting Industrial Worker Distraction Caused by Mobile Phone Usage Using Object Detection and Pose Estimation Models</w:t>
-      </w:r>
-    </w:p>
-    <w:p>
-      <w:pPr>
+        <w:t xml:space="preserve">Design and Implementation of a Quantum-Secure</w:t>
+      </w:r>
+    </w:p>
+    <w:p>
+      <w:pPr>
+        <w:pStyle w:val="Title"/>
         <w:jc w:val="center"/>
         <w:rPr>
           <w:rFonts w:ascii="Times New Roman" w:cs="Times New Roman" w:eastAsia="Times New Roman" w:hAnsi="Times New Roman"/>
-        </w:rPr>
-      </w:pPr>
-      <w:bookmarkStart w:colFirst="0" w:colLast="0" w:name="_7hwagvv0qfyz" w:id="0"/>
+          <w:sz w:val="48"/>
+          <w:szCs w:val="48"/>
+        </w:rPr>
+      </w:pPr>
+      <w:bookmarkStart w:colFirst="0" w:colLast="0" w:name="_t06t91kcllae" w:id="0"/>
       <w:bookmarkEnd w:id="0"/>
+      <w:r>
+        <w:rPr>
+          <w:rFonts w:ascii="Times New Roman" w:cs="Times New Roman" w:eastAsia="Times New Roman" w:hAnsi="Times New Roman"/>
+          <w:sz w:val="48"/>
+          <w:szCs w:val="48"/>
+          <w:rtl w:val="0"/>
+        </w:rPr>
+        <w:t xml:space="preserve">Email System Using Quantum Key Distribution and</w:t>
+      </w:r>
+    </w:p>
+    <w:p>
+      <w:pPr>
+        <w:pStyle w:val="Title"/>
+        <w:jc w:val="center"/>
+        <w:rPr>
+          <w:rFonts w:ascii="Times New Roman" w:cs="Times New Roman" w:eastAsia="Times New Roman" w:hAnsi="Times New Roman"/>
+          <w:sz w:val="48"/>
+          <w:szCs w:val="48"/>
+        </w:rPr>
+      </w:pPr>
+      <w:r>
+        <w:rPr>
+          <w:rFonts w:ascii="Times New Roman" w:cs="Times New Roman" w:eastAsia="Times New Roman" w:hAnsi="Times New Roman"/>
+          <w:sz w:val="48"/>
+          <w:szCs w:val="48"/>
+          <w:rtl w:val="0"/>
+        </w:rPr>
+        <w:t xml:space="preserve">Post-Quantum Cryptography</w:t>
+      </w:r>
+    </w:p>
+    <w:p>
+      <w:pPr>
+        <w:jc w:val="center"/>
+        <w:rPr>
+          <w:rFonts w:ascii="Times New Roman" w:cs="Times New Roman" w:eastAsia="Times New Roman" w:hAnsi="Times New Roman"/>
+        </w:rPr>
+      </w:pPr>
+      <w:bookmarkStart w:colFirst="0" w:colLast="0" w:name="_7hwagvv0qfyz" w:id="1"/>
+      <w:bookmarkEnd w:id="1"/>
       <w:r>
         <w:rPr>
           <w:rtl w:val="0"/>
@@ -1332,12 +1374,12 @@
           <wp:inline distB="114300" distT="114300" distL="114300" distR="114300">
             <wp:extent cx="3038475" cy="2082800"/>
             <wp:effectExtent b="0" l="0" r="0" t="0"/>
-            <wp:docPr id="5" name="image7.png"/>
+            <wp:docPr id="5" name="image5.png"/>
             <a:graphic>
               <a:graphicData uri="http://schemas.openxmlformats.org/drawingml/2006/picture">
                 <pic:pic>
                   <pic:nvPicPr>
-                    <pic:cNvPr id="0" name="image7.png"/>
+                    <pic:cNvPr id="0" name="image5.png"/>
                     <pic:cNvPicPr preferRelativeResize="0"/>
                   </pic:nvPicPr>
                   <pic:blipFill>
@@ -1844,12 +1886,12 @@
           <wp:inline distB="114300" distT="114300" distL="114300" distR="114300">
             <wp:extent cx="3038475" cy="3365500"/>
             <wp:effectExtent b="0" l="0" r="0" t="0"/>
-            <wp:docPr id="4" name="image3.png"/>
+            <wp:docPr id="4" name="image2.png"/>
             <a:graphic>
               <a:graphicData uri="http://schemas.openxmlformats.org/drawingml/2006/picture">
                 <pic:pic>
                   <pic:nvPicPr>
-                    <pic:cNvPr id="0" name="image3.png"/>
+                    <pic:cNvPr id="0" name="image2.png"/>
                     <pic:cNvPicPr preferRelativeResize="0"/>
                   </pic:nvPicPr>
                   <pic:blipFill>
@@ -1918,12 +1960,12 @@
           <wp:inline distB="114300" distT="114300" distL="114300" distR="114300">
             <wp:extent cx="3038475" cy="3365500"/>
             <wp:effectExtent b="0" l="0" r="0" t="0"/>
-            <wp:docPr id="3" name="image8.png"/>
+            <wp:docPr id="3" name="image7.png"/>
             <a:graphic>
               <a:graphicData uri="http://schemas.openxmlformats.org/drawingml/2006/picture">
                 <pic:pic>
                   <pic:nvPicPr>
-                    <pic:cNvPr id="0" name="image8.png"/>
+                    <pic:cNvPr id="0" name="image7.png"/>
                     <pic:cNvPicPr preferRelativeResize="0"/>
                   </pic:nvPicPr>
                   <pic:blipFill>
@@ -1992,12 +2034,12 @@
           <wp:inline distB="114300" distT="114300" distL="114300" distR="114300">
             <wp:extent cx="3038475" cy="3365500"/>
             <wp:effectExtent b="0" l="0" r="0" t="0"/>
-            <wp:docPr id="1" name="image2.png"/>
+            <wp:docPr id="1" name="image3.png"/>
             <a:graphic>
               <a:graphicData uri="http://schemas.openxmlformats.org/drawingml/2006/picture">
                 <pic:pic>
                   <pic:nvPicPr>
-                    <pic:cNvPr id="0" name="image2.png"/>
+                    <pic:cNvPr id="0" name="image3.png"/>
                     <pic:cNvPicPr preferRelativeResize="0"/>
                   </pic:nvPicPr>
                   <pic:blipFill>
@@ -2052,12 +2094,12 @@
           <wp:inline distB="114300" distT="114300" distL="114300" distR="114300">
             <wp:extent cx="3038475" cy="3365500"/>
             <wp:effectExtent b="0" l="0" r="0" t="0"/>
-            <wp:docPr id="8" name="image5.png"/>
+            <wp:docPr id="8" name="image1.png"/>
             <a:graphic>
               <a:graphicData uri="http://schemas.openxmlformats.org/drawingml/2006/picture">
                 <pic:pic>
                   <pic:nvPicPr>
-                    <pic:cNvPr id="0" name="image5.png"/>
+                    <pic:cNvPr id="0" name="image1.png"/>
                     <pic:cNvPicPr preferRelativeResize="0"/>
                   </pic:nvPicPr>
                   <pic:blipFill>
@@ -2127,12 +2169,12 @@
           <wp:inline distB="114300" distT="114300" distL="114300" distR="114300">
             <wp:extent cx="3038475" cy="1803400"/>
             <wp:effectExtent b="0" l="0" r="0" t="0"/>
-            <wp:docPr id="6" name="image1.png"/>
+            <wp:docPr id="6" name="image8.png"/>
             <a:graphic>
               <a:graphicData uri="http://schemas.openxmlformats.org/drawingml/2006/picture">
                 <pic:pic>
                   <pic:nvPicPr>
-                    <pic:cNvPr id="0" name="image1.png"/>
+                    <pic:cNvPr id="0" name="image8.png"/>
                     <pic:cNvPicPr preferRelativeResize="0"/>
                   </pic:nvPicPr>
                   <pic:blipFill>

</xml_diff>